<commit_message>
Har bir ma'ruza alohida Word faylda (maruzalar/)
Tartib: reja, tayanch tushunchalar, matn, nazorat savollari,
har ma'ruzaga 8 tadan adabiyot. Adabiyotlardagi sahifa sonlari olib tashlandi.

Co-Authored-By: Claude Opus 5.5 <noreply@anthropic.com>
Claude-Session: https://claude.ai/code/session_019NvabW2ERdJVSnaG6ykZeM
</commit_message>
<xml_diff>
--- a/oquv_materiallari/Kognitiv_tilshunoslik_maruzalar.docx
+++ b/oquv_materiallari/Kognitiv_tilshunoslik_maruzalar.docx
@@ -14278,7 +14278,7 @@
         <w:jc w:val="both"/>
       </w:pPr>
       <w:r>
-        <w:t xml:space="preserve">Кубрякова Е.С., Демьянков В.З., Панкрац Ю.Г., Лузина Л.Г. Краткий словарь когнитивных терминов. – М.: Филол. ф-т МГУ, 1996. – 245 с.</w:t>
+        <w:t xml:space="preserve">Кубрякова Е.С., Демьянков В.З., Панкрац Ю.Г., Лузина Л.Г. Краткий словарь когнитивных терминов. – М.: Филол. ф-т МГУ, 1996.</w:t>
       </w:r>
     </w:p>
     <w:p>
@@ -14292,7 +14292,7 @@
         <w:jc w:val="both"/>
       </w:pPr>
       <w:r>
-        <w:t xml:space="preserve">Кубрякова Е.С. Язык и знание: На пути получения знаний о языке: Части речи с когнитивной точки зрения. Роль языка в познании мира. – М.: Языки славянской культуры, 2004. – 560 с.</w:t>
+        <w:t xml:space="preserve">Кубрякова Е.С. Язык и знание: На пути получения знаний о языке: Части речи с когнитивной точки зрения. Роль языка в познании мира. – М.: Языки славянской культуры, 2004.</w:t>
       </w:r>
     </w:p>
     <w:p>
@@ -14306,7 +14306,7 @@
         <w:jc w:val="both"/>
       </w:pPr>
       <w:r>
-        <w:t xml:space="preserve">Попова З.Д., Стернин И.А. Когнитивная лингвистика. – М.: АСТ: Восток–Запад, 2007. – 314 с.</w:t>
+        <w:t xml:space="preserve">Попова З.Д., Стернин И.А. Когнитивная лингвистика. – М.: АСТ: Восток–Запад, 2007.</w:t>
       </w:r>
     </w:p>
     <w:p>
@@ -14320,7 +14320,7 @@
         <w:jc w:val="both"/>
       </w:pPr>
       <w:r>
-        <w:t xml:space="preserve">Маслова В.А. Когнитивная лингвистика. – Минск: ТетраСистемс, 2004. – 256 с.</w:t>
+        <w:t xml:space="preserve">Маслова В.А. Когнитивная лингвистика. – Минск: ТетраСистемс, 2004.</w:t>
       </w:r>
     </w:p>
     <w:p>
@@ -14334,7 +14334,7 @@
         <w:jc w:val="both"/>
       </w:pPr>
       <w:r>
-        <w:t xml:space="preserve">Маслова В.А. Лингвокультурология. – М.: Академия, 2001. – 208 с.</w:t>
+        <w:t xml:space="preserve">Маслова В.А. Лингвокультурология. – М.: Академия, 2001.</w:t>
       </w:r>
     </w:p>
     <w:p>
@@ -14348,7 +14348,7 @@
         <w:jc w:val="both"/>
       </w:pPr>
       <w:r>
-        <w:t xml:space="preserve">Болдырев Н.Н. Когнитивная семантика. – Тамбов: Изд-во ТГУ, 2001. – 123 с.</w:t>
+        <w:t xml:space="preserve">Болдырев Н.Н. Когнитивная семантика. – Тамбов: Изд-во ТГУ, 2001.</w:t>
       </w:r>
     </w:p>
     <w:p>
@@ -14412,7 +14412,7 @@
         <w:jc w:val="both"/>
       </w:pPr>
       <w:r>
-        <w:t xml:space="preserve">Гумбольдт В. фон. Избранные труды по языкознанию. – М.: Прогресс, 1984. – 400 с.</w:t>
+        <w:t xml:space="preserve">Гумбольдт В. фон. Избранные труды по языкознанию. – М.: Прогресс, 1984.</w:t>
       </w:r>
     </w:p>
     <w:p>
@@ -14426,7 +14426,7 @@
         <w:jc w:val="both"/>
       </w:pPr>
       <w:r>
-        <w:t xml:space="preserve">Бенвенист Э. Общая лингвистика. – М.: Прогресс, 1974. – 447 с.</w:t>
+        <w:t xml:space="preserve">Бенвенист Э. Общая лингвистика. – М.: Прогресс, 1974.</w:t>
       </w:r>
     </w:p>
     <w:p>
@@ -14440,7 +14440,7 @@
         <w:jc w:val="both"/>
       </w:pPr>
       <w:r>
-        <w:t xml:space="preserve">Караулов Ю.Н. Русский язык и языковая личность. – М.: Наука, 1987. – 263 с.</w:t>
+        <w:t xml:space="preserve">Караулов Ю.Н. Русский язык и языковая личность. – М.: Наука, 1987.</w:t>
       </w:r>
     </w:p>
     <w:p>
@@ -14454,7 +14454,7 @@
         <w:jc w:val="both"/>
       </w:pPr>
       <w:r>
-        <w:t xml:space="preserve">Выготский Л.С. Мышление и речь. – М.; Л.: Соцэкгиз, 1934. – 324 с.</w:t>
+        <w:t xml:space="preserve">Выготский Л.С. Мышление и речь. – М.; Л.: Соцэкгиз, 1934.</w:t>
       </w:r>
     </w:p>
     <w:p>
@@ -14496,7 +14496,7 @@
         <w:jc w:val="both"/>
       </w:pPr>
       <w:r>
-        <w:t xml:space="preserve">Степанов Ю.С. Константы: Словарь русской культуры. Опыт исследования. – М.: Языки русской культуры, 1997. – 824 с.</w:t>
+        <w:t xml:space="preserve">Степанов Ю.С. Константы: Словарь русской культуры. Опыт исследования. – М.: Языки русской культуры, 1997.</w:t>
       </w:r>
     </w:p>
     <w:p>
@@ -14510,7 +14510,7 @@
         <w:jc w:val="both"/>
       </w:pPr>
       <w:r>
-        <w:t xml:space="preserve">Минский М. Фреймы для представления знаний. – М.: Энергия, 1979. – 152 с.</w:t>
+        <w:t xml:space="preserve">Минский М. Фреймы для представления знаний. – М.: Энергия, 1979.</w:t>
       </w:r>
     </w:p>
     <w:p>
@@ -14524,7 +14524,7 @@
         <w:jc w:val="both"/>
       </w:pPr>
       <w:r>
-        <w:t xml:space="preserve">Дейк Т.А. ван. Язык. Познание. Коммуникация. – М.: Прогресс, 1989. – 312 с.</w:t>
+        <w:t xml:space="preserve">Дейк Т.А. ван. Язык. Познание. Коммуникация. – М.: Прогресс, 1989.</w:t>
       </w:r>
     </w:p>
     <w:p>
@@ -14538,7 +14538,7 @@
         <w:jc w:val="both"/>
       </w:pPr>
       <w:r>
-        <w:t xml:space="preserve">Лакофф Дж., Джонсон М. Метафоры, которыми мы живём. – М.: Едиториал УРСС, 2004. – 256 с.</w:t>
+        <w:t xml:space="preserve">Лакофф Дж., Джонсон М. Метафоры, которыми мы живём. – М.: Едиториал УРСС, 2004.</w:t>
       </w:r>
     </w:p>
     <w:p>
@@ -14552,7 +14552,7 @@
         <w:jc w:val="both"/>
       </w:pPr>
       <w:r>
-        <w:t xml:space="preserve">Лакофф Дж. Женщины, огонь и опасные вещи: Что категории языка говорят нам о мышлении. – М.: Языки славянской культуры, 2004. – 792 с.</w:t>
+        <w:t xml:space="preserve">Лакофф Дж. Женщины, огонь и опасные вещи: Что категории языка говорят нам о мышлении. – М.: Языки славянской культуры, 2004.</w:t>
       </w:r>
     </w:p>
     <w:p>
@@ -14566,7 +14566,7 @@
         <w:jc w:val="both"/>
       </w:pPr>
       <w:r>
-        <w:t xml:space="preserve">Вежбицкая А. Понимание культур через посредство ключевых слов. – М.: Языки славянской культуры, 2001. – 288 с.</w:t>
+        <w:t xml:space="preserve">Вежбицкая А. Понимание культур через посредство ключевых слов. – М.: Языки славянской культуры, 2001.</w:t>
       </w:r>
     </w:p>
     <w:p>
@@ -14580,7 +14580,7 @@
         <w:jc w:val="both"/>
       </w:pPr>
       <w:r>
-        <w:t xml:space="preserve">Воробьёв В.В. Лингвокультурология (теория и методы). – М.: Изд-во РУДН, 1997. – 331 с.</w:t>
+        <w:t xml:space="preserve">Воробьёв В.В. Лингвокультурология (теория и методы). – М.: Изд-во РУДН, 1997.</w:t>
       </w:r>
     </w:p>
     <w:p>
@@ -14594,7 +14594,7 @@
         <w:jc w:val="both"/>
       </w:pPr>
       <w:r>
-        <w:t xml:space="preserve">Телия В.Н. Русская фразеология: Семантический, прагматический и лингвокультурологический аспекты. – М.: Языки русской культуры, 1996. – 288 с.</w:t>
+        <w:t xml:space="preserve">Телия В.Н. Русская фразеология: Семантический, прагматический и лингвокультурологический аспекты. – М.: Языки русской культуры, 1996.</w:t>
       </w:r>
     </w:p>
     <w:p>
@@ -14608,7 +14608,7 @@
         <w:jc w:val="both"/>
       </w:pPr>
       <w:r>
-        <w:t xml:space="preserve">Верещагин Е.М., Костомаров В.Г. Язык и культура. – М.: Изд-во МГУ, 1973. – 233 с.</w:t>
+        <w:t xml:space="preserve">Верещагин Е.М., Костомаров В.Г. Язык и культура. – М.: Изд-во МГУ, 1973.</w:t>
       </w:r>
     </w:p>
     <w:p>
@@ -14622,7 +14622,7 @@
         <w:jc w:val="both"/>
       </w:pPr>
       <w:r>
-        <w:t xml:space="preserve">Тер-Минасова С.Г. Язык и межкультурная коммуникация. – М.: Слово, 2000. – 624 с.</w:t>
+        <w:t xml:space="preserve">Тер-Минасова С.Г. Язык и межкультурная коммуникация. – М.: Слово, 2000.</w:t>
       </w:r>
     </w:p>
     <w:p>
@@ -14636,7 +14636,7 @@
         <w:jc w:val="both"/>
       </w:pPr>
       <w:r>
-        <w:t xml:space="preserve">Карасик В.И. Языковой круг: личность, концепты, дискурс. – Волгоград: Перемена, 2002. – 477 с.</w:t>
+        <w:t xml:space="preserve">Карасик В.И. Языковой круг: личность, концепты, дискурс. – Волгоград: Перемена, 2002.</w:t>
       </w:r>
     </w:p>
     <w:p>

</xml_diff>